<commit_message>
Build the write-off act from the official OCI-17-90 Excel
Control Interno's write-off act (act 00019) turned up, so the template no
longer has to be a proposal. The builder now reads the official Excel like
the OCI-21-37 one does and fails if its labels change. The act keeps the
official columns, the report and authorized totals with their difference,
the Consejo Universitario vote and the Vicefinanciera reports.
</commit_message>
<xml_diff>
--- a/templates/formats/OCI-17-90-BAJA-v1.docx
+++ b/templates/formats/OCI-17-90-BAJA-v1.docx
@@ -36,7 +36,7 @@
                 <w:sz w:val="18"/>
                 <w:szCs w:val="18"/>
               </w:rPr>
-              <w:t xml:space="preserve">Acta de baja No.</w:t>
+              <w:t xml:space="preserve">BAJA DE ACTIVOS No.</w:t>
             </w:r>
           </w:p>
         </w:tc>
@@ -84,7 +84,7 @@
                 <w:sz w:val="18"/>
                 <w:szCs w:val="18"/>
               </w:rPr>
-              <w:t xml:space="preserve">Fecha del acta</w:t>
+              <w:t xml:space="preserve">Fecha de la Baja Activos Fijos:</w:t>
             </w:r>
           </w:p>
         </w:tc>
@@ -105,118 +105,6 @@
                 <w:szCs w:val="18"/>
               </w:rPr>
               <w:t xml:space="preserve">{{documento.fecha}}</w:t>
-            </w:r>
-          </w:p>
-        </w:tc>
-      </w:tr>
-      <w:tr>
-        <w:trPr>
-          <w:cantSplit/>
-        </w:trPr>
-        <w:tc>
-          <w:tcPr>
-            <w:tcW w:w="3600" w:type="dxa"/>
-            <w:shd w:val="clear" w:color="auto" w:fill="D9E2F3"/>
-            <w:vAlign w:val="center"/>
-          </w:tcPr>
-          <w:p>
-            <w:pPr>
-              <w:spacing w:before="0" w:after="0" w:line="240" w:lineRule="auto"/>
-              <w:jc w:val="left"/>
-            </w:pPr>
-            <w:r>
-              <w:rPr>
-                <w:rFonts w:ascii="Metropolis" w:eastAsia="Metropolis" w:hAnsi="Metropolis" w:cs="Metropolis"/>
-                <w:b/>
-                <w:bCs/>
-                <w:sz w:val="18"/>
-                <w:szCs w:val="18"/>
-              </w:rPr>
-              <w:t xml:space="preserve">Centro de costo</w:t>
-            </w:r>
-          </w:p>
-        </w:tc>
-        <w:tc>
-          <w:tcPr>
-            <w:tcW w:w="10800" w:type="dxa"/>
-            <w:vAlign w:val="center"/>
-          </w:tcPr>
-          <w:p>
-            <w:pPr>
-              <w:spacing w:before="0" w:after="0" w:line="240" w:lineRule="auto"/>
-              <w:jc w:val="left"/>
-            </w:pPr>
-            <w:r>
-              <w:rPr>
-                <w:rFonts w:ascii="Metropolis" w:eastAsia="Metropolis" w:hAnsi="Metropolis" w:cs="Metropolis"/>
-                <w:sz w:val="18"/>
-                <w:szCs w:val="18"/>
-              </w:rPr>
-              <w:t xml:space="preserve">{{centroCosto.codigo}}</w:t>
-            </w:r>
-            <w:r>
-              <w:rPr>
-                <w:rFonts w:ascii="Metropolis" w:eastAsia="Metropolis" w:hAnsi="Metropolis" w:cs="Metropolis"/>
-                <w:sz w:val="18"/>
-                <w:szCs w:val="18"/>
-              </w:rPr>
-              <w:t xml:space="preserve"> </w:t>
-            </w:r>
-            <w:r>
-              <w:rPr>
-                <w:rFonts w:ascii="Metropolis" w:eastAsia="Metropolis" w:hAnsi="Metropolis" w:cs="Metropolis"/>
-                <w:sz w:val="18"/>
-                <w:szCs w:val="18"/>
-              </w:rPr>
-              <w:t xml:space="preserve">{{centroCosto.nombre}}</w:t>
-            </w:r>
-          </w:p>
-        </w:tc>
-      </w:tr>
-      <w:tr>
-        <w:trPr>
-          <w:cantSplit/>
-        </w:trPr>
-        <w:tc>
-          <w:tcPr>
-            <w:tcW w:w="3600" w:type="dxa"/>
-            <w:shd w:val="clear" w:color="auto" w:fill="D9E2F3"/>
-            <w:vAlign w:val="center"/>
-          </w:tcPr>
-          <w:p>
-            <w:pPr>
-              <w:spacing w:before="0" w:after="0" w:line="240" w:lineRule="auto"/>
-              <w:jc w:val="left"/>
-            </w:pPr>
-            <w:r>
-              <w:rPr>
-                <w:rFonts w:ascii="Metropolis" w:eastAsia="Metropolis" w:hAnsi="Metropolis" w:cs="Metropolis"/>
-                <w:b/>
-                <w:bCs/>
-                <w:sz w:val="18"/>
-                <w:szCs w:val="18"/>
-              </w:rPr>
-              <w:t xml:space="preserve">Dependencia</w:t>
-            </w:r>
-          </w:p>
-        </w:tc>
-        <w:tc>
-          <w:tcPr>
-            <w:tcW w:w="10800" w:type="dxa"/>
-            <w:vAlign w:val="center"/>
-          </w:tcPr>
-          <w:p>
-            <w:pPr>
-              <w:spacing w:before="0" w:after="0" w:line="240" w:lineRule="auto"/>
-              <w:jc w:val="left"/>
-            </w:pPr>
-            <w:r>
-              <w:rPr>
-                <w:rFonts w:ascii="Metropolis" w:eastAsia="Metropolis" w:hAnsi="Metropolis" w:cs="Metropolis"/>
-                <w:sz w:val="18"/>
-                <w:szCs w:val="18"/>
-              </w:rPr>
-              <w:t xml:space="preserve">{{centroCosto.unidad.nombre}}</w:t>
             </w:r>
           </w:p>
         </w:tc>
@@ -224,19 +112,16 @@
     </w:tbl>
     <w:p>
       <w:pPr>
-        <w:keepNext/>
-        <w:spacing w:before="120" w:after="40" w:line="240" w:lineRule="auto"/>
+        <w:spacing w:before="0" w:after="120" w:line="240" w:lineRule="auto"/>
         <w:jc w:val="left"/>
       </w:pPr>
       <w:r>
         <w:rPr>
           <w:rFonts w:ascii="Metropolis" w:eastAsia="Metropolis" w:hAnsi="Metropolis" w:cs="Metropolis"/>
-          <w:b/>
-          <w:bCs/>
           <w:sz w:val="18"/>
           <w:szCs w:val="18"/>
         </w:rPr>
-        <w:t xml:space="preserve">Datos de la baja</w:t>
+        <w:t xml:space="preserve"> </w:t>
       </w:r>
     </w:p>
     <w:tbl>
@@ -247,53 +132,273 @@
         <w:tblLook w:val="04A0" w:firstRow="1" w:lastRow="0" w:firstColumn="1" w:lastColumn="0" w:noHBand="0" w:noVBand="1"/>
       </w:tblPr>
       <w:tblGrid>
-        <w:gridCol w:w="3600"/>
-        <w:gridCol w:w="10800"/>
+        <w:gridCol w:w="500"/>
+        <w:gridCol w:w="900"/>
+        <w:gridCol w:w="1100"/>
+        <w:gridCol w:w="2900"/>
+        <w:gridCol w:w="800"/>
+        <w:gridCol w:w="1200"/>
+        <w:gridCol w:w="2000"/>
+        <w:gridCol w:w="1100"/>
+        <w:gridCol w:w="1300"/>
+        <w:gridCol w:w="900"/>
+        <w:gridCol w:w="1700"/>
       </w:tblGrid>
       <w:tr>
         <w:trPr>
           <w:cantSplit/>
+          <w:tblHeader/>
         </w:trPr>
         <w:tc>
           <w:tcPr>
-            <w:tcW w:w="3600" w:type="dxa"/>
+            <w:tcW w:w="500" w:type="dxa"/>
             <w:shd w:val="clear" w:color="auto" w:fill="D9E2F3"/>
             <w:vAlign w:val="center"/>
           </w:tcPr>
           <w:p>
             <w:pPr>
               <w:spacing w:before="0" w:after="0" w:line="240" w:lineRule="auto"/>
-              <w:jc w:val="left"/>
+              <w:jc w:val="center"/>
             </w:pPr>
             <w:r>
               <w:rPr>
                 <w:rFonts w:ascii="Metropolis" w:eastAsia="Metropolis" w:hAnsi="Metropolis" w:cs="Metropolis"/>
                 <w:b/>
                 <w:bCs/>
-                <w:sz w:val="18"/>
-                <w:szCs w:val="18"/>
-              </w:rPr>
-              <w:t xml:space="preserve">Motivo de la baja</w:t>
-            </w:r>
-          </w:p>
-        </w:tc>
-        <w:tc>
-          <w:tcPr>
-            <w:tcW w:w="10800" w:type="dxa"/>
-            <w:vAlign w:val="center"/>
-          </w:tcPr>
-          <w:p>
-            <w:pPr>
-              <w:spacing w:before="0" w:after="0" w:line="240" w:lineRule="auto"/>
-              <w:jc w:val="left"/>
-            </w:pPr>
-            <w:r>
-              <w:rPr>
-                <w:rFonts w:ascii="Metropolis" w:eastAsia="Metropolis" w:hAnsi="Metropolis" w:cs="Metropolis"/>
-                <w:sz w:val="18"/>
-                <w:szCs w:val="18"/>
-              </w:rPr>
-              <w:t xml:space="preserve">{{campos.motivo}}</w:t>
+                <w:sz w:val="14"/>
+                <w:szCs w:val="14"/>
+              </w:rPr>
+              <w:t xml:space="preserve">#</w:t>
+            </w:r>
+          </w:p>
+        </w:tc>
+        <w:tc>
+          <w:tcPr>
+            <w:tcW w:w="900" w:type="dxa"/>
+            <w:shd w:val="clear" w:color="auto" w:fill="D9E2F3"/>
+            <w:vAlign w:val="center"/>
+          </w:tcPr>
+          <w:p>
+            <w:pPr>
+              <w:spacing w:before="0" w:after="0" w:line="240" w:lineRule="auto"/>
+              <w:jc w:val="center"/>
+            </w:pPr>
+            <w:r>
+              <w:rPr>
+                <w:rFonts w:ascii="Metropolis" w:eastAsia="Metropolis" w:hAnsi="Metropolis" w:cs="Metropolis"/>
+                <w:b/>
+                <w:bCs/>
+                <w:sz w:val="14"/>
+                <w:szCs w:val="14"/>
+              </w:rPr>
+              <w:t xml:space="preserve">Id</w:t>
+            </w:r>
+          </w:p>
+        </w:tc>
+        <w:tc>
+          <w:tcPr>
+            <w:tcW w:w="1100" w:type="dxa"/>
+            <w:shd w:val="clear" w:color="auto" w:fill="D9E2F3"/>
+            <w:vAlign w:val="center"/>
+          </w:tcPr>
+          <w:p>
+            <w:pPr>
+              <w:spacing w:before="0" w:after="0" w:line="240" w:lineRule="auto"/>
+              <w:jc w:val="center"/>
+            </w:pPr>
+            <w:r>
+              <w:rPr>
+                <w:rFonts w:ascii="Metropolis" w:eastAsia="Metropolis" w:hAnsi="Metropolis" w:cs="Metropolis"/>
+                <w:b/>
+                <w:bCs/>
+                <w:sz w:val="14"/>
+                <w:szCs w:val="14"/>
+              </w:rPr>
+              <w:t xml:space="preserve">Código de barras</w:t>
+            </w:r>
+          </w:p>
+        </w:tc>
+        <w:tc>
+          <w:tcPr>
+            <w:tcW w:w="2900" w:type="dxa"/>
+            <w:shd w:val="clear" w:color="auto" w:fill="D9E2F3"/>
+            <w:vAlign w:val="center"/>
+          </w:tcPr>
+          <w:p>
+            <w:pPr>
+              <w:spacing w:before="0" w:after="0" w:line="240" w:lineRule="auto"/>
+              <w:jc w:val="center"/>
+            </w:pPr>
+            <w:r>
+              <w:rPr>
+                <w:rFonts w:ascii="Metropolis" w:eastAsia="Metropolis" w:hAnsi="Metropolis" w:cs="Metropolis"/>
+                <w:b/>
+                <w:bCs/>
+                <w:sz w:val="14"/>
+                <w:szCs w:val="14"/>
+              </w:rPr>
+              <w:t xml:space="preserve">Descripción del activo</w:t>
+            </w:r>
+          </w:p>
+        </w:tc>
+        <w:tc>
+          <w:tcPr>
+            <w:tcW w:w="800" w:type="dxa"/>
+            <w:shd w:val="clear" w:color="auto" w:fill="D9E2F3"/>
+            <w:vAlign w:val="center"/>
+          </w:tcPr>
+          <w:p>
+            <w:pPr>
+              <w:spacing w:before="0" w:after="0" w:line="240" w:lineRule="auto"/>
+              <w:jc w:val="center"/>
+            </w:pPr>
+            <w:r>
+              <w:rPr>
+                <w:rFonts w:ascii="Metropolis" w:eastAsia="Metropolis" w:hAnsi="Metropolis" w:cs="Metropolis"/>
+                <w:b/>
+                <w:bCs/>
+                <w:sz w:val="14"/>
+                <w:szCs w:val="14"/>
+              </w:rPr>
+              <w:t xml:space="preserve">Cantidad</w:t>
+            </w:r>
+          </w:p>
+        </w:tc>
+        <w:tc>
+          <w:tcPr>
+            <w:tcW w:w="1200" w:type="dxa"/>
+            <w:shd w:val="clear" w:color="auto" w:fill="D9E2F3"/>
+            <w:vAlign w:val="center"/>
+          </w:tcPr>
+          <w:p>
+            <w:pPr>
+              <w:spacing w:before="0" w:after="0" w:line="240" w:lineRule="auto"/>
+              <w:jc w:val="center"/>
+            </w:pPr>
+            <w:r>
+              <w:rPr>
+                <w:rFonts w:ascii="Metropolis" w:eastAsia="Metropolis" w:hAnsi="Metropolis" w:cs="Metropolis"/>
+                <w:b/>
+                <w:bCs/>
+                <w:sz w:val="14"/>
+                <w:szCs w:val="14"/>
+              </w:rPr>
+              <w:t xml:space="preserve">Documento</w:t>
+            </w:r>
+          </w:p>
+        </w:tc>
+        <w:tc>
+          <w:tcPr>
+            <w:tcW w:w="2000" w:type="dxa"/>
+            <w:shd w:val="clear" w:color="auto" w:fill="D9E2F3"/>
+            <w:vAlign w:val="center"/>
+          </w:tcPr>
+          <w:p>
+            <w:pPr>
+              <w:spacing w:before="0" w:after="0" w:line="240" w:lineRule="auto"/>
+              <w:jc w:val="center"/>
+            </w:pPr>
+            <w:r>
+              <w:rPr>
+                <w:rFonts w:ascii="Metropolis" w:eastAsia="Metropolis" w:hAnsi="Metropolis" w:cs="Metropolis"/>
+                <w:b/>
+                <w:bCs/>
+                <w:sz w:val="14"/>
+                <w:szCs w:val="14"/>
+              </w:rPr>
+              <w:t xml:space="preserve">Centro</w:t>
+            </w:r>
+          </w:p>
+        </w:tc>
+        <w:tc>
+          <w:tcPr>
+            <w:tcW w:w="1100" w:type="dxa"/>
+            <w:shd w:val="clear" w:color="auto" w:fill="D9E2F3"/>
+            <w:vAlign w:val="center"/>
+          </w:tcPr>
+          <w:p>
+            <w:pPr>
+              <w:spacing w:before="0" w:after="0" w:line="240" w:lineRule="auto"/>
+              <w:jc w:val="center"/>
+            </w:pPr>
+            <w:r>
+              <w:rPr>
+                <w:rFonts w:ascii="Metropolis" w:eastAsia="Metropolis" w:hAnsi="Metropolis" w:cs="Metropolis"/>
+                <w:b/>
+                <w:bCs/>
+                <w:sz w:val="14"/>
+                <w:szCs w:val="14"/>
+              </w:rPr>
+              <w:t xml:space="preserve">Fecha Compra</w:t>
+            </w:r>
+          </w:p>
+        </w:tc>
+        <w:tc>
+          <w:tcPr>
+            <w:tcW w:w="1300" w:type="dxa"/>
+            <w:shd w:val="clear" w:color="auto" w:fill="D9E2F3"/>
+            <w:vAlign w:val="center"/>
+          </w:tcPr>
+          <w:p>
+            <w:pPr>
+              <w:spacing w:before="0" w:after="0" w:line="240" w:lineRule="auto"/>
+              <w:jc w:val="center"/>
+            </w:pPr>
+            <w:r>
+              <w:rPr>
+                <w:rFonts w:ascii="Metropolis" w:eastAsia="Metropolis" w:hAnsi="Metropolis" w:cs="Metropolis"/>
+                <w:b/>
+                <w:bCs/>
+                <w:sz w:val="14"/>
+                <w:szCs w:val="14"/>
+              </w:rPr>
+              <w:t xml:space="preserve">Precio compra</w:t>
+            </w:r>
+          </w:p>
+        </w:tc>
+        <w:tc>
+          <w:tcPr>
+            <w:tcW w:w="900" w:type="dxa"/>
+            <w:shd w:val="clear" w:color="auto" w:fill="D9E2F3"/>
+            <w:vAlign w:val="center"/>
+          </w:tcPr>
+          <w:p>
+            <w:pPr>
+              <w:spacing w:before="0" w:after="0" w:line="240" w:lineRule="auto"/>
+              <w:jc w:val="center"/>
+            </w:pPr>
+            <w:r>
+              <w:rPr>
+                <w:rFonts w:ascii="Metropolis" w:eastAsia="Metropolis" w:hAnsi="Metropolis" w:cs="Metropolis"/>
+                <w:b/>
+                <w:bCs/>
+                <w:sz w:val="14"/>
+                <w:szCs w:val="14"/>
+              </w:rPr>
+              <w:t xml:space="preserve">Estado</w:t>
+            </w:r>
+          </w:p>
+        </w:tc>
+        <w:tc>
+          <w:tcPr>
+            <w:tcW w:w="1700" w:type="dxa"/>
+            <w:shd w:val="clear" w:color="auto" w:fill="D9E2F3"/>
+            <w:vAlign w:val="center"/>
+          </w:tcPr>
+          <w:p>
+            <w:pPr>
+              <w:spacing w:before="0" w:after="0" w:line="240" w:lineRule="auto"/>
+              <w:jc w:val="center"/>
+            </w:pPr>
+            <w:r>
+              <w:rPr>
+                <w:rFonts w:ascii="Metropolis" w:eastAsia="Metropolis" w:hAnsi="Metropolis" w:cs="Metropolis"/>
+                <w:b/>
+                <w:bCs/>
+                <w:sz w:val="14"/>
+                <w:szCs w:val="14"/>
+              </w:rPr>
+              <w:t xml:space="preserve">Observaciones</w:t>
             </w:r>
           </w:p>
         </w:tc>
@@ -304,8 +409,67 @@
         </w:trPr>
         <w:tc>
           <w:tcPr>
-            <w:tcW w:w="3600" w:type="dxa"/>
-            <w:shd w:val="clear" w:color="auto" w:fill="D9E2F3"/>
+            <w:tcW w:w="500" w:type="dxa"/>
+            <w:vAlign w:val="center"/>
+          </w:tcPr>
+          <w:p>
+            <w:pPr>
+              <w:spacing w:before="0" w:after="0" w:line="240" w:lineRule="auto"/>
+              <w:jc w:val="center"/>
+            </w:pPr>
+            <w:r>
+              <w:rPr>
+                <w:rFonts w:ascii="Metropolis" w:eastAsia="Metropolis" w:hAnsi="Metropolis" w:cs="Metropolis"/>
+                <w:sz w:val="14"/>
+                <w:szCs w:val="14"/>
+              </w:rPr>
+              <w:t xml:space="preserve">{{#activos}}{{indice}}</w:t>
+            </w:r>
+          </w:p>
+        </w:tc>
+        <w:tc>
+          <w:tcPr>
+            <w:tcW w:w="900" w:type="dxa"/>
+            <w:vAlign w:val="center"/>
+          </w:tcPr>
+          <w:p>
+            <w:pPr>
+              <w:spacing w:before="0" w:after="0" w:line="240" w:lineRule="auto"/>
+              <w:jc w:val="center"/>
+            </w:pPr>
+            <w:r>
+              <w:rPr>
+                <w:rFonts w:ascii="Metropolis" w:eastAsia="Metropolis" w:hAnsi="Metropolis" w:cs="Metropolis"/>
+                <w:sz w:val="14"/>
+                <w:szCs w:val="14"/>
+              </w:rPr>
+              <w:t xml:space="preserve">{{idOrigen}}</w:t>
+            </w:r>
+          </w:p>
+        </w:tc>
+        <w:tc>
+          <w:tcPr>
+            <w:tcW w:w="1100" w:type="dxa"/>
+            <w:vAlign w:val="center"/>
+          </w:tcPr>
+          <w:p>
+            <w:pPr>
+              <w:spacing w:before="0" w:after="0" w:line="240" w:lineRule="auto"/>
+              <w:jc w:val="center"/>
+            </w:pPr>
+            <w:r>
+              <w:rPr>
+                <w:rFonts w:ascii="Metropolis" w:eastAsia="Metropolis" w:hAnsi="Metropolis" w:cs="Metropolis"/>
+                <w:sz w:val="14"/>
+                <w:szCs w:val="14"/>
+              </w:rPr>
+              <w:t xml:space="preserve">{{codigo}}</w:t>
+            </w:r>
+          </w:p>
+        </w:tc>
+        <w:tc>
+          <w:tcPr>
+            <w:tcW w:w="2900" w:type="dxa"/>
             <w:vAlign w:val="center"/>
           </w:tcPr>
           <w:p>
@@ -316,18 +480,36 @@
             <w:r>
               <w:rPr>
                 <w:rFonts w:ascii="Metropolis" w:eastAsia="Metropolis" w:hAnsi="Metropolis" w:cs="Metropolis"/>
-                <w:b/>
-                <w:bCs/>
-                <w:sz w:val="18"/>
-                <w:szCs w:val="18"/>
-              </w:rPr>
-              <w:t xml:space="preserve">Concepto técnico o estado físico</w:t>
-            </w:r>
-          </w:p>
-        </w:tc>
-        <w:tc>
-          <w:tcPr>
-            <w:tcW w:w="10800" w:type="dxa"/>
+                <w:sz w:val="14"/>
+                <w:szCs w:val="14"/>
+              </w:rPr>
+              <w:t xml:space="preserve">{{descripcion}}</w:t>
+            </w:r>
+          </w:p>
+        </w:tc>
+        <w:tc>
+          <w:tcPr>
+            <w:tcW w:w="800" w:type="dxa"/>
+            <w:vAlign w:val="center"/>
+          </w:tcPr>
+          <w:p>
+            <w:pPr>
+              <w:spacing w:before="0" w:after="0" w:line="240" w:lineRule="auto"/>
+              <w:jc w:val="center"/>
+            </w:pPr>
+            <w:r>
+              <w:rPr>
+                <w:rFonts w:ascii="Metropolis" w:eastAsia="Metropolis" w:hAnsi="Metropolis" w:cs="Metropolis"/>
+                <w:sz w:val="14"/>
+                <w:szCs w:val="14"/>
+              </w:rPr>
+              <w:t xml:space="preserve">{{campos.cantidad}}</w:t>
+            </w:r>
+          </w:p>
+        </w:tc>
+        <w:tc>
+          <w:tcPr>
+            <w:tcW w:w="1200" w:type="dxa"/>
             <w:vAlign w:val="center"/>
           </w:tcPr>
           <w:p>
@@ -338,22 +520,16 @@
             <w:r>
               <w:rPr>
                 <w:rFonts w:ascii="Metropolis" w:eastAsia="Metropolis" w:hAnsi="Metropolis" w:cs="Metropolis"/>
-                <w:sz w:val="18"/>
-                <w:szCs w:val="18"/>
-              </w:rPr>
-              <w:t xml:space="preserve">{{campos.conceptoTecnico}}</w:t>
-            </w:r>
-          </w:p>
-        </w:tc>
-      </w:tr>
-      <w:tr>
-        <w:trPr>
-          <w:cantSplit/>
-        </w:trPr>
-        <w:tc>
-          <w:tcPr>
-            <w:tcW w:w="3600" w:type="dxa"/>
-            <w:shd w:val="clear" w:color="auto" w:fill="D9E2F3"/>
+                <w:sz w:val="14"/>
+                <w:szCs w:val="14"/>
+              </w:rPr>
+              <w:t xml:space="preserve">{{campos.documento}}</w:t>
+            </w:r>
+          </w:p>
+        </w:tc>
+        <w:tc>
+          <w:tcPr>
+            <w:tcW w:w="2000" w:type="dxa"/>
             <w:vAlign w:val="center"/>
           </w:tcPr>
           <w:p>
@@ -364,18 +540,76 @@
             <w:r>
               <w:rPr>
                 <w:rFonts w:ascii="Metropolis" w:eastAsia="Metropolis" w:hAnsi="Metropolis" w:cs="Metropolis"/>
-                <w:b/>
-                <w:bCs/>
-                <w:sz w:val="18"/>
-                <w:szCs w:val="18"/>
-              </w:rPr>
-              <w:t xml:space="preserve">Disposición final del bien</w:t>
-            </w:r>
-          </w:p>
-        </w:tc>
-        <w:tc>
-          <w:tcPr>
-            <w:tcW w:w="10800" w:type="dxa"/>
+                <w:sz w:val="14"/>
+                <w:szCs w:val="14"/>
+              </w:rPr>
+              <w:t xml:space="preserve">{{campos.centro}}</w:t>
+            </w:r>
+          </w:p>
+        </w:tc>
+        <w:tc>
+          <w:tcPr>
+            <w:tcW w:w="1100" w:type="dxa"/>
+            <w:vAlign w:val="center"/>
+          </w:tcPr>
+          <w:p>
+            <w:pPr>
+              <w:spacing w:before="0" w:after="0" w:line="240" w:lineRule="auto"/>
+              <w:jc w:val="center"/>
+            </w:pPr>
+            <w:r>
+              <w:rPr>
+                <w:rFonts w:ascii="Metropolis" w:eastAsia="Metropolis" w:hAnsi="Metropolis" w:cs="Metropolis"/>
+                <w:sz w:val="14"/>
+                <w:szCs w:val="14"/>
+              </w:rPr>
+              <w:t xml:space="preserve">{{campos.fechaCompra}}</w:t>
+            </w:r>
+          </w:p>
+        </w:tc>
+        <w:tc>
+          <w:tcPr>
+            <w:tcW w:w="1300" w:type="dxa"/>
+            <w:vAlign w:val="center"/>
+          </w:tcPr>
+          <w:p>
+            <w:pPr>
+              <w:spacing w:before="0" w:after="0" w:line="240" w:lineRule="auto"/>
+              <w:jc w:val="right"/>
+            </w:pPr>
+            <w:r>
+              <w:rPr>
+                <w:rFonts w:ascii="Metropolis" w:eastAsia="Metropolis" w:hAnsi="Metropolis" w:cs="Metropolis"/>
+                <w:sz w:val="14"/>
+                <w:szCs w:val="14"/>
+              </w:rPr>
+              <w:t xml:space="preserve">{{campos.precioCompra}}</w:t>
+            </w:r>
+          </w:p>
+        </w:tc>
+        <w:tc>
+          <w:tcPr>
+            <w:tcW w:w="900" w:type="dxa"/>
+            <w:vAlign w:val="center"/>
+          </w:tcPr>
+          <w:p>
+            <w:pPr>
+              <w:spacing w:before="0" w:after="0" w:line="240" w:lineRule="auto"/>
+              <w:jc w:val="center"/>
+            </w:pPr>
+            <w:r>
+              <w:rPr>
+                <w:rFonts w:ascii="Metropolis" w:eastAsia="Metropolis" w:hAnsi="Metropolis" w:cs="Metropolis"/>
+                <w:sz w:val="14"/>
+                <w:szCs w:val="14"/>
+              </w:rPr>
+              <w:t xml:space="preserve">{{campos.estado}}</w:t>
+            </w:r>
+          </w:p>
+        </w:tc>
+        <w:tc>
+          <w:tcPr>
+            <w:tcW w:w="1700" w:type="dxa"/>
             <w:vAlign w:val="center"/>
           </w:tcPr>
           <w:p>
@@ -386,58 +620,10 @@
             <w:r>
               <w:rPr>
                 <w:rFonts w:ascii="Metropolis" w:eastAsia="Metropolis" w:hAnsi="Metropolis" w:cs="Metropolis"/>
-                <w:sz w:val="18"/>
-                <w:szCs w:val="18"/>
-              </w:rPr>
-              <w:t xml:space="preserve">{{campos.disposicionFinal}}</w:t>
-            </w:r>
-          </w:p>
-        </w:tc>
-      </w:tr>
-      <w:tr>
-        <w:trPr>
-          <w:cantSplit/>
-        </w:trPr>
-        <w:tc>
-          <w:tcPr>
-            <w:tcW w:w="3600" w:type="dxa"/>
-            <w:shd w:val="clear" w:color="auto" w:fill="D9E2F3"/>
-            <w:vAlign w:val="center"/>
-          </w:tcPr>
-          <w:p>
-            <w:pPr>
-              <w:spacing w:before="0" w:after="0" w:line="240" w:lineRule="auto"/>
-              <w:jc w:val="left"/>
-            </w:pPr>
-            <w:r>
-              <w:rPr>
-                <w:rFonts w:ascii="Metropolis" w:eastAsia="Metropolis" w:hAnsi="Metropolis" w:cs="Metropolis"/>
-                <w:b/>
-                <w:bCs/>
-                <w:sz w:val="18"/>
-                <w:szCs w:val="18"/>
-              </w:rPr>
-              <w:t xml:space="preserve">Observaciones</w:t>
-            </w:r>
-          </w:p>
-        </w:tc>
-        <w:tc>
-          <w:tcPr>
-            <w:tcW w:w="10800" w:type="dxa"/>
-            <w:vAlign w:val="center"/>
-          </w:tcPr>
-          <w:p>
-            <w:pPr>
-              <w:spacing w:before="0" w:after="0" w:line="240" w:lineRule="auto"/>
-              <w:jc w:val="left"/>
-            </w:pPr>
-            <w:r>
-              <w:rPr>
-                <w:rFonts w:ascii="Metropolis" w:eastAsia="Metropolis" w:hAnsi="Metropolis" w:cs="Metropolis"/>
-                <w:sz w:val="18"/>
-                <w:szCs w:val="18"/>
-              </w:rPr>
-              <w:t xml:space="preserve">{{campos.observaciones}}</w:t>
+                <w:sz w:val="14"/>
+                <w:szCs w:val="14"/>
+              </w:rPr>
+              <w:t xml:space="preserve">{{campos.observaciones}}{{/activos}}</w:t>
             </w:r>
           </w:p>
         </w:tc>
@@ -445,19 +631,16 @@
     </w:tbl>
     <w:p>
       <w:pPr>
-        <w:keepNext/>
-        <w:spacing w:before="120" w:after="40" w:line="240" w:lineRule="auto"/>
+        <w:spacing w:before="0" w:after="60" w:line="240" w:lineRule="auto"/>
         <w:jc w:val="left"/>
       </w:pPr>
       <w:r>
         <w:rPr>
           <w:rFonts w:ascii="Metropolis" w:eastAsia="Metropolis" w:hAnsi="Metropolis" w:cs="Metropolis"/>
-          <w:b/>
-          <w:bCs/>
           <w:sz w:val="18"/>
           <w:szCs w:val="18"/>
         </w:rPr>
-        <w:t xml:space="preserve">Activos dados de baja</w:t>
+        <w:t xml:space="preserve"> </w:t>
       </w:r>
     </w:p>
     <w:tbl>
@@ -468,201 +651,53 @@
         <w:tblLook w:val="04A0" w:firstRow="1" w:lastRow="0" w:firstColumn="1" w:lastColumn="0" w:noHBand="0" w:noVBand="1"/>
       </w:tblPr>
       <w:tblGrid>
-        <w:gridCol w:w="600"/>
-        <w:gridCol w:w="1500"/>
-        <w:gridCol w:w="3700"/>
-        <w:gridCol w:w="1700"/>
-        <w:gridCol w:w="1400"/>
-        <w:gridCol w:w="1700"/>
-        <w:gridCol w:w="2200"/>
-        <w:gridCol w:w="1600"/>
+        <w:gridCol w:w="11200"/>
+        <w:gridCol w:w="3200"/>
       </w:tblGrid>
       <w:tr>
         <w:trPr>
           <w:cantSplit/>
-          <w:tblHeader/>
         </w:trPr>
         <w:tc>
           <w:tcPr>
-            <w:tcW w:w="600" w:type="dxa"/>
+            <w:tcW w:w="11200" w:type="dxa"/>
             <w:shd w:val="clear" w:color="auto" w:fill="D9E2F3"/>
             <w:vAlign w:val="center"/>
           </w:tcPr>
           <w:p>
             <w:pPr>
               <w:spacing w:before="0" w:after="0" w:line="240" w:lineRule="auto"/>
-              <w:jc w:val="center"/>
+              <w:jc w:val="right"/>
             </w:pPr>
             <w:r>
               <w:rPr>
                 <w:rFonts w:ascii="Metropolis" w:eastAsia="Metropolis" w:hAnsi="Metropolis" w:cs="Metropolis"/>
                 <w:b/>
                 <w:bCs/>
-                <w:sz w:val="14"/>
-                <w:szCs w:val="14"/>
-              </w:rPr>
-              <w:t xml:space="preserve">#</w:t>
-            </w:r>
-          </w:p>
-        </w:tc>
-        <w:tc>
-          <w:tcPr>
-            <w:tcW w:w="1500" w:type="dxa"/>
-            <w:shd w:val="clear" w:color="auto" w:fill="D9E2F3"/>
-            <w:vAlign w:val="center"/>
-          </w:tcPr>
-          <w:p>
-            <w:pPr>
-              <w:spacing w:before="0" w:after="0" w:line="240" w:lineRule="auto"/>
-              <w:jc w:val="center"/>
-            </w:pPr>
-            <w:r>
-              <w:rPr>
-                <w:rFonts w:ascii="Metropolis" w:eastAsia="Metropolis" w:hAnsi="Metropolis" w:cs="Metropolis"/>
-                <w:b/>
-                <w:bCs/>
-                <w:sz w:val="14"/>
-                <w:szCs w:val="14"/>
-              </w:rPr>
-              <w:t xml:space="preserve">Código</w:t>
-            </w:r>
-          </w:p>
-        </w:tc>
-        <w:tc>
-          <w:tcPr>
-            <w:tcW w:w="3700" w:type="dxa"/>
-            <w:shd w:val="clear" w:color="auto" w:fill="D9E2F3"/>
-            <w:vAlign w:val="center"/>
-          </w:tcPr>
-          <w:p>
-            <w:pPr>
-              <w:spacing w:before="0" w:after="0" w:line="240" w:lineRule="auto"/>
-              <w:jc w:val="center"/>
-            </w:pPr>
-            <w:r>
-              <w:rPr>
-                <w:rFonts w:ascii="Metropolis" w:eastAsia="Metropolis" w:hAnsi="Metropolis" w:cs="Metropolis"/>
-                <w:b/>
-                <w:bCs/>
-                <w:sz w:val="14"/>
-                <w:szCs w:val="14"/>
-              </w:rPr>
-              <w:t xml:space="preserve">Descripción</w:t>
-            </w:r>
-          </w:p>
-        </w:tc>
-        <w:tc>
-          <w:tcPr>
-            <w:tcW w:w="1700" w:type="dxa"/>
-            <w:shd w:val="clear" w:color="auto" w:fill="D9E2F3"/>
-            <w:vAlign w:val="center"/>
-          </w:tcPr>
-          <w:p>
-            <w:pPr>
-              <w:spacing w:before="0" w:after="0" w:line="240" w:lineRule="auto"/>
-              <w:jc w:val="center"/>
-            </w:pPr>
-            <w:r>
-              <w:rPr>
-                <w:rFonts w:ascii="Metropolis" w:eastAsia="Metropolis" w:hAnsi="Metropolis" w:cs="Metropolis"/>
-                <w:b/>
-                <w:bCs/>
-                <w:sz w:val="14"/>
-                <w:szCs w:val="14"/>
-              </w:rPr>
-              <w:t xml:space="preserve">Serial</w:t>
-            </w:r>
-          </w:p>
-        </w:tc>
-        <w:tc>
-          <w:tcPr>
-            <w:tcW w:w="1400" w:type="dxa"/>
-            <w:shd w:val="clear" w:color="auto" w:fill="D9E2F3"/>
-            <w:vAlign w:val="center"/>
-          </w:tcPr>
-          <w:p>
-            <w:pPr>
-              <w:spacing w:before="0" w:after="0" w:line="240" w:lineRule="auto"/>
-              <w:jc w:val="center"/>
-            </w:pPr>
-            <w:r>
-              <w:rPr>
-                <w:rFonts w:ascii="Metropolis" w:eastAsia="Metropolis" w:hAnsi="Metropolis" w:cs="Metropolis"/>
-                <w:b/>
-                <w:bCs/>
-                <w:sz w:val="14"/>
-                <w:szCs w:val="14"/>
-              </w:rPr>
-              <w:t xml:space="preserve">Fecha de adquisición</w:t>
-            </w:r>
-          </w:p>
-        </w:tc>
-        <w:tc>
-          <w:tcPr>
-            <w:tcW w:w="1700" w:type="dxa"/>
-            <w:shd w:val="clear" w:color="auto" w:fill="D9E2F3"/>
-            <w:vAlign w:val="center"/>
-          </w:tcPr>
-          <w:p>
-            <w:pPr>
-              <w:spacing w:before="0" w:after="0" w:line="240" w:lineRule="auto"/>
-              <w:jc w:val="center"/>
-            </w:pPr>
-            <w:r>
-              <w:rPr>
-                <w:rFonts w:ascii="Metropolis" w:eastAsia="Metropolis" w:hAnsi="Metropolis" w:cs="Metropolis"/>
-                <w:b/>
-                <w:bCs/>
-                <w:sz w:val="14"/>
-                <w:szCs w:val="14"/>
-              </w:rPr>
-              <w:t xml:space="preserve">Costo</w:t>
-            </w:r>
-          </w:p>
-        </w:tc>
-        <w:tc>
-          <w:tcPr>
-            <w:tcW w:w="2200" w:type="dxa"/>
-            <w:shd w:val="clear" w:color="auto" w:fill="D9E2F3"/>
-            <w:vAlign w:val="center"/>
-          </w:tcPr>
-          <w:p>
-            <w:pPr>
-              <w:spacing w:before="0" w:after="0" w:line="240" w:lineRule="auto"/>
-              <w:jc w:val="center"/>
-            </w:pPr>
-            <w:r>
-              <w:rPr>
-                <w:rFonts w:ascii="Metropolis" w:eastAsia="Metropolis" w:hAnsi="Metropolis" w:cs="Metropolis"/>
-                <w:b/>
-                <w:bCs/>
-                <w:sz w:val="14"/>
-                <w:szCs w:val="14"/>
-              </w:rPr>
-              <w:t xml:space="preserve">Valor en libros</w:t>
-            </w:r>
-          </w:p>
-        </w:tc>
-        <w:tc>
-          <w:tcPr>
-            <w:tcW w:w="1600" w:type="dxa"/>
-            <w:shd w:val="clear" w:color="auto" w:fill="D9E2F3"/>
-            <w:vAlign w:val="center"/>
-          </w:tcPr>
-          <w:p>
-            <w:pPr>
-              <w:spacing w:before="0" w:after="0" w:line="240" w:lineRule="auto"/>
-              <w:jc w:val="center"/>
-            </w:pPr>
-            <w:r>
-              <w:rPr>
-                <w:rFonts w:ascii="Metropolis" w:eastAsia="Metropolis" w:hAnsi="Metropolis" w:cs="Metropolis"/>
-                <w:b/>
-                <w:bCs/>
-                <w:sz w:val="14"/>
-                <w:szCs w:val="14"/>
-              </w:rPr>
-              <w:t xml:space="preserve">Condición</w:t>
+                <w:sz w:val="16"/>
+                <w:szCs w:val="16"/>
+              </w:rPr>
+              <w:t xml:space="preserve">Total Informe Baja:</w:t>
+            </w:r>
+          </w:p>
+        </w:tc>
+        <w:tc>
+          <w:tcPr>
+            <w:tcW w:w="3200" w:type="dxa"/>
+            <w:vAlign w:val="center"/>
+          </w:tcPr>
+          <w:p>
+            <w:pPr>
+              <w:spacing w:before="0" w:after="0" w:line="240" w:lineRule="auto"/>
+              <w:jc w:val="right"/>
+            </w:pPr>
+            <w:r>
+              <w:rPr>
+                <w:rFonts w:ascii="Metropolis" w:eastAsia="Metropolis" w:hAnsi="Metropolis" w:cs="Metropolis"/>
+                <w:sz w:val="16"/>
+                <w:szCs w:val="16"/>
+              </w:rPr>
+              <w:t xml:space="preserve">{{campos.totalInforme}}</w:t>
             </w:r>
           </w:p>
         </w:tc>
@@ -673,107 +708,8 @@
         </w:trPr>
         <w:tc>
           <w:tcPr>
-            <w:tcW w:w="600" w:type="dxa"/>
-            <w:vAlign w:val="center"/>
-          </w:tcPr>
-          <w:p>
-            <w:pPr>
-              <w:spacing w:before="0" w:after="0" w:line="240" w:lineRule="auto"/>
-              <w:jc w:val="center"/>
-            </w:pPr>
-            <w:r>
-              <w:rPr>
-                <w:rFonts w:ascii="Metropolis" w:eastAsia="Metropolis" w:hAnsi="Metropolis" w:cs="Metropolis"/>
-                <w:sz w:val="14"/>
-                <w:szCs w:val="14"/>
-              </w:rPr>
-              <w:t xml:space="preserve">{{#activos}}{{indice}}</w:t>
-            </w:r>
-          </w:p>
-        </w:tc>
-        <w:tc>
-          <w:tcPr>
-            <w:tcW w:w="1500" w:type="dxa"/>
-            <w:vAlign w:val="center"/>
-          </w:tcPr>
-          <w:p>
-            <w:pPr>
-              <w:spacing w:before="0" w:after="0" w:line="240" w:lineRule="auto"/>
-              <w:jc w:val="left"/>
-            </w:pPr>
-            <w:r>
-              <w:rPr>
-                <w:rFonts w:ascii="Metropolis" w:eastAsia="Metropolis" w:hAnsi="Metropolis" w:cs="Metropolis"/>
-                <w:sz w:val="14"/>
-                <w:szCs w:val="14"/>
-              </w:rPr>
-              <w:t xml:space="preserve">{{codigo}}</w:t>
-            </w:r>
-          </w:p>
-        </w:tc>
-        <w:tc>
-          <w:tcPr>
-            <w:tcW w:w="3700" w:type="dxa"/>
-            <w:vAlign w:val="center"/>
-          </w:tcPr>
-          <w:p>
-            <w:pPr>
-              <w:spacing w:before="0" w:after="0" w:line="240" w:lineRule="auto"/>
-              <w:jc w:val="left"/>
-            </w:pPr>
-            <w:r>
-              <w:rPr>
-                <w:rFonts w:ascii="Metropolis" w:eastAsia="Metropolis" w:hAnsi="Metropolis" w:cs="Metropolis"/>
-                <w:sz w:val="14"/>
-                <w:szCs w:val="14"/>
-              </w:rPr>
-              <w:t xml:space="preserve">{{descripcion}}</w:t>
-            </w:r>
-          </w:p>
-        </w:tc>
-        <w:tc>
-          <w:tcPr>
-            <w:tcW w:w="1700" w:type="dxa"/>
-            <w:vAlign w:val="center"/>
-          </w:tcPr>
-          <w:p>
-            <w:pPr>
-              <w:spacing w:before="0" w:after="0" w:line="240" w:lineRule="auto"/>
-              <w:jc w:val="left"/>
-            </w:pPr>
-            <w:r>
-              <w:rPr>
-                <w:rFonts w:ascii="Metropolis" w:eastAsia="Metropolis" w:hAnsi="Metropolis" w:cs="Metropolis"/>
-                <w:sz w:val="14"/>
-                <w:szCs w:val="14"/>
-              </w:rPr>
-              <w:t xml:space="preserve">{{campos.serial}}</w:t>
-            </w:r>
-          </w:p>
-        </w:tc>
-        <w:tc>
-          <w:tcPr>
-            <w:tcW w:w="1400" w:type="dxa"/>
-            <w:vAlign w:val="center"/>
-          </w:tcPr>
-          <w:p>
-            <w:pPr>
-              <w:spacing w:before="0" w:after="0" w:line="240" w:lineRule="auto"/>
-              <w:jc w:val="center"/>
-            </w:pPr>
-            <w:r>
-              <w:rPr>
-                <w:rFonts w:ascii="Metropolis" w:eastAsia="Metropolis" w:hAnsi="Metropolis" w:cs="Metropolis"/>
-                <w:sz w:val="14"/>
-                <w:szCs w:val="14"/>
-              </w:rPr>
-              <w:t xml:space="preserve">{{campos.fechaAdquisicion}}</w:t>
-            </w:r>
-          </w:p>
-        </w:tc>
-        <w:tc>
-          <w:tcPr>
-            <w:tcW w:w="1700" w:type="dxa"/>
+            <w:tcW w:w="11200" w:type="dxa"/>
+            <w:shd w:val="clear" w:color="auto" w:fill="D9E2F3"/>
             <w:vAlign w:val="center"/>
           </w:tcPr>
           <w:p>
@@ -784,16 +720,18 @@
             <w:r>
               <w:rPr>
                 <w:rFonts w:ascii="Metropolis" w:eastAsia="Metropolis" w:hAnsi="Metropolis" w:cs="Metropolis"/>
-                <w:sz w:val="14"/>
-                <w:szCs w:val="14"/>
-              </w:rPr>
-              <w:t xml:space="preserve">{{campos.costo}}</w:t>
-            </w:r>
-          </w:p>
-        </w:tc>
-        <w:tc>
-          <w:tcPr>
-            <w:tcW w:w="2200" w:type="dxa"/>
+                <w:b/>
+                <w:bCs/>
+                <w:sz w:val="16"/>
+                <w:szCs w:val="16"/>
+              </w:rPr>
+              <w:t xml:space="preserve">Total Autorizado Baja:</w:t>
+            </w:r>
+          </w:p>
+        </w:tc>
+        <w:tc>
+          <w:tcPr>
+            <w:tcW w:w="3200" w:type="dxa"/>
             <w:vAlign w:val="center"/>
           </w:tcPr>
           <w:p>
@@ -804,30 +742,58 @@
             <w:r>
               <w:rPr>
                 <w:rFonts w:ascii="Metropolis" w:eastAsia="Metropolis" w:hAnsi="Metropolis" w:cs="Metropolis"/>
-                <w:sz w:val="14"/>
-                <w:szCs w:val="14"/>
-              </w:rPr>
-              <w:t xml:space="preserve">{{campos.valorLibros}}</w:t>
-            </w:r>
-          </w:p>
-        </w:tc>
-        <w:tc>
-          <w:tcPr>
-            <w:tcW w:w="1600" w:type="dxa"/>
-            <w:vAlign w:val="center"/>
-          </w:tcPr>
-          <w:p>
-            <w:pPr>
-              <w:spacing w:before="0" w:after="0" w:line="240" w:lineRule="auto"/>
-              <w:jc w:val="center"/>
-            </w:pPr>
-            <w:r>
-              <w:rPr>
-                <w:rFonts w:ascii="Metropolis" w:eastAsia="Metropolis" w:hAnsi="Metropolis" w:cs="Metropolis"/>
-                <w:sz w:val="14"/>
-                <w:szCs w:val="14"/>
-              </w:rPr>
-              <w:t xml:space="preserve">{{estado}}{{/activos}}</w:t>
+                <w:sz w:val="16"/>
+                <w:szCs w:val="16"/>
+              </w:rPr>
+              <w:t xml:space="preserve">{{campos.totalAutorizado}}</w:t>
+            </w:r>
+          </w:p>
+        </w:tc>
+      </w:tr>
+      <w:tr>
+        <w:trPr>
+          <w:cantSplit/>
+        </w:trPr>
+        <w:tc>
+          <w:tcPr>
+            <w:tcW w:w="11200" w:type="dxa"/>
+            <w:shd w:val="clear" w:color="auto" w:fill="D9E2F3"/>
+            <w:vAlign w:val="center"/>
+          </w:tcPr>
+          <w:p>
+            <w:pPr>
+              <w:spacing w:before="0" w:after="0" w:line="240" w:lineRule="auto"/>
+              <w:jc w:val="right"/>
+            </w:pPr>
+            <w:r>
+              <w:rPr>
+                <w:rFonts w:ascii="Metropolis" w:eastAsia="Metropolis" w:hAnsi="Metropolis" w:cs="Metropolis"/>
+                <w:b/>
+                <w:bCs/>
+                <w:sz w:val="16"/>
+                <w:szCs w:val="16"/>
+              </w:rPr>
+              <w:t xml:space="preserve">Diferencia</w:t>
+            </w:r>
+          </w:p>
+        </w:tc>
+        <w:tc>
+          <w:tcPr>
+            <w:tcW w:w="3200" w:type="dxa"/>
+            <w:vAlign w:val="center"/>
+          </w:tcPr>
+          <w:p>
+            <w:pPr>
+              <w:spacing w:before="0" w:after="0" w:line="240" w:lineRule="auto"/>
+              <w:jc w:val="right"/>
+            </w:pPr>
+            <w:r>
+              <w:rPr>
+                <w:rFonts w:ascii="Metropolis" w:eastAsia="Metropolis" w:hAnsi="Metropolis" w:cs="Metropolis"/>
+                <w:sz w:val="16"/>
+                <w:szCs w:val="16"/>
+              </w:rPr>
+              <w:t xml:space="preserve">{{campos.diferencia}}</w:t>
             </w:r>
           </w:p>
         </w:tc>
@@ -835,67 +801,7 @@
     </w:tbl>
     <w:p>
       <w:pPr>
-        <w:spacing w:before="60" w:after="40" w:line="240" w:lineRule="auto"/>
-        <w:jc w:val="left"/>
-      </w:pPr>
-      <w:r>
-        <w:rPr>
-          <w:rFonts w:ascii="Metropolis" w:eastAsia="Metropolis" w:hAnsi="Metropolis" w:cs="Metropolis"/>
-          <w:b/>
-          <w:bCs/>
-          <w:sz w:val="16"/>
-          <w:szCs w:val="16"/>
-        </w:rPr>
-        <w:t xml:space="preserve">Total de activos: </w:t>
-      </w:r>
-      <w:r>
-        <w:rPr>
-          <w:rFonts w:ascii="Metropolis" w:eastAsia="Metropolis" w:hAnsi="Metropolis" w:cs="Metropolis"/>
-          <w:sz w:val="16"/>
-          <w:szCs w:val="16"/>
-        </w:rPr>
-        <w:t xml:space="preserve">{{totalElementos}}</w:t>
-      </w:r>
-      <w:r>
-        <w:rPr>
-          <w:rFonts w:ascii="Metropolis" w:eastAsia="Metropolis" w:hAnsi="Metropolis" w:cs="Metropolis"/>
-          <w:b/>
-          <w:bCs/>
-          <w:sz w:val="16"/>
-          <w:szCs w:val="16"/>
-        </w:rPr>
-        <w:t xml:space="preserve">   Costo total: </w:t>
-      </w:r>
-      <w:r>
-        <w:rPr>
-          <w:rFonts w:ascii="Metropolis" w:eastAsia="Metropolis" w:hAnsi="Metropolis" w:cs="Metropolis"/>
-          <w:sz w:val="16"/>
-          <w:szCs w:val="16"/>
-        </w:rPr>
-        <w:t xml:space="preserve">{{campos.totalCosto}}</w:t>
-      </w:r>
-      <w:r>
-        <w:rPr>
-          <w:rFonts w:ascii="Metropolis" w:eastAsia="Metropolis" w:hAnsi="Metropolis" w:cs="Metropolis"/>
-          <w:b/>
-          <w:bCs/>
-          <w:sz w:val="16"/>
-          <w:szCs w:val="16"/>
-        </w:rPr>
-        <w:t xml:space="preserve">   Valor en libros total: </w:t>
-      </w:r>
-      <w:r>
-        <w:rPr>
-          <w:rFonts w:ascii="Metropolis" w:eastAsia="Metropolis" w:hAnsi="Metropolis" w:cs="Metropolis"/>
-          <w:sz w:val="16"/>
-          <w:szCs w:val="16"/>
-        </w:rPr>
-        <w:t xml:space="preserve">{{campos.totalValorLibros}}</w:t>
-      </w:r>
-    </w:p>
-    <w:p>
-      <w:pPr>
-        <w:spacing w:before="0" w:after="120" w:line="240" w:lineRule="auto"/>
+        <w:spacing w:before="0" w:after="0" w:line="240" w:lineRule="auto"/>
         <w:jc w:val="left"/>
       </w:pPr>
       <w:r>
@@ -904,7 +810,23 @@
           <w:sz w:val="14"/>
           <w:szCs w:val="14"/>
         </w:rPr>
-        <w:t xml:space="preserve">Valor en libros con la depreciación registrada al </w:t>
+        <w:t xml:space="preserve">{{#campos.nota}}</w:t>
+      </w:r>
+    </w:p>
+    <w:p>
+      <w:pPr>
+        <w:spacing w:before="0" w:after="60" w:line="240" w:lineRule="auto"/>
+        <w:jc w:val="left"/>
+      </w:pPr>
+      <w:r>
+        <w:rPr>
+          <w:rFonts w:ascii="Metropolis" w:eastAsia="Metropolis" w:hAnsi="Metropolis" w:cs="Metropolis"/>
+          <w:b/>
+          <w:bCs/>
+          <w:sz w:val="14"/>
+          <w:szCs w:val="14"/>
+        </w:rPr>
+        <w:t xml:space="preserve">Nota: </w:t>
       </w:r>
       <w:r>
         <w:rPr>
@@ -912,15 +834,21 @@
           <w:sz w:val="14"/>
           <w:szCs w:val="14"/>
         </w:rPr>
-        <w:t xml:space="preserve">{{campos.fechaValor}}</w:t>
+        <w:t xml:space="preserve">{{campos.nota}}</w:t>
       </w:r>
+    </w:p>
+    <w:p>
+      <w:pPr>
+        <w:spacing w:before="0" w:after="0" w:line="240" w:lineRule="auto"/>
+        <w:jc w:val="left"/>
+      </w:pPr>
       <w:r>
         <w:rPr>
           <w:rFonts w:ascii="Metropolis" w:eastAsia="Metropolis" w:hAnsi="Metropolis" w:cs="Metropolis"/>
           <w:sz w:val="14"/>
           <w:szCs w:val="14"/>
         </w:rPr>
-        <w:t xml:space="preserve">. Si un activo no tiene depreciación se muestra su costo.</w:t>
+        <w:t xml:space="preserve">{{/campos.nota}}</w:t>
       </w:r>
     </w:p>
     <w:p>
@@ -978,7 +906,7 @@
     <w:p>
       <w:pPr>
         <w:keepNext/>
-        <w:spacing w:before="120" w:after="40" w:line="240" w:lineRule="auto"/>
+        <w:spacing w:before="120" w:after="60" w:line="240" w:lineRule="auto"/>
         <w:jc w:val="left"/>
       </w:pPr>
       <w:r>
@@ -989,7 +917,7 @@
           <w:sz w:val="18"/>
           <w:szCs w:val="18"/>
         </w:rPr>
-        <w:t xml:space="preserve">Firmas</w:t>
+        <w:t xml:space="preserve">REVISAN:</w:t>
       </w:r>
     </w:p>
     <w:tbl>
@@ -1001,10 +929,9 @@
       </w:tblPr>
       <w:tblGrid>
         <w:gridCol w:w="3000"/>
-        <w:gridCol w:w="4000"/>
-        <w:gridCol w:w="2400"/>
-        <w:gridCol w:w="2600"/>
-        <w:gridCol w:w="2400"/>
+        <w:gridCol w:w="4400"/>
+        <w:gridCol w:w="3600"/>
+        <w:gridCol w:w="3400"/>
       </w:tblGrid>
       <w:tr>
         <w:trPr>
@@ -1030,13 +957,13 @@
                 <w:sz w:val="16"/>
                 <w:szCs w:val="16"/>
               </w:rPr>
-              <w:t xml:space="preserve">Firma como</w:t>
-            </w:r>
-          </w:p>
-        </w:tc>
-        <w:tc>
-          <w:tcPr>
-            <w:tcW w:w="4000" w:type="dxa"/>
+              <w:t xml:space="preserve">Firma por</w:t>
+            </w:r>
+          </w:p>
+        </w:tc>
+        <w:tc>
+          <w:tcPr>
+            <w:tcW w:w="4400" w:type="dxa"/>
             <w:shd w:val="clear" w:color="auto" w:fill="D9E2F3"/>
             <w:vAlign w:val="center"/>
           </w:tcPr>
@@ -1059,7 +986,7 @@
         </w:tc>
         <w:tc>
           <w:tcPr>
-            <w:tcW w:w="2400" w:type="dxa"/>
+            <w:tcW w:w="3600" w:type="dxa"/>
             <w:shd w:val="clear" w:color="auto" w:fill="D9E2F3"/>
             <w:vAlign w:val="center"/>
           </w:tcPr>
@@ -1076,36 +1003,13 @@
                 <w:sz w:val="16"/>
                 <w:szCs w:val="16"/>
               </w:rPr>
-              <w:t xml:space="preserve">Documento</w:t>
-            </w:r>
-          </w:p>
-        </w:tc>
-        <w:tc>
-          <w:tcPr>
-            <w:tcW w:w="2600" w:type="dxa"/>
-            <w:shd w:val="clear" w:color="auto" w:fill="D9E2F3"/>
-            <w:vAlign w:val="center"/>
-          </w:tcPr>
-          <w:p>
-            <w:pPr>
-              <w:spacing w:before="0" w:after="0" w:line="240" w:lineRule="auto"/>
-              <w:jc w:val="center"/>
-            </w:pPr>
-            <w:r>
-              <w:rPr>
-                <w:rFonts w:ascii="Metropolis" w:eastAsia="Metropolis" w:hAnsi="Metropolis" w:cs="Metropolis"/>
-                <w:b/>
-                <w:bCs/>
-                <w:sz w:val="16"/>
-                <w:szCs w:val="16"/>
-              </w:rPr>
               <w:t xml:space="preserve">Cargo</w:t>
             </w:r>
           </w:p>
         </w:tc>
         <w:tc>
           <w:tcPr>
-            <w:tcW w:w="2400" w:type="dxa"/>
+            <w:tcW w:w="3400" w:type="dxa"/>
             <w:shd w:val="clear" w:color="auto" w:fill="D9E2F3"/>
             <w:vAlign w:val="center"/>
           </w:tcPr>
@@ -1153,7 +1057,7 @@
         </w:tc>
         <w:tc>
           <w:tcPr>
-            <w:tcW w:w="4000" w:type="dxa"/>
+            <w:tcW w:w="4400" w:type="dxa"/>
             <w:vAlign w:val="center"/>
           </w:tcPr>
           <w:p>
@@ -1173,7 +1077,7 @@
         </w:tc>
         <w:tc>
           <w:tcPr>
-            <w:tcW w:w="2400" w:type="dxa"/>
+            <w:tcW w:w="3600" w:type="dxa"/>
             <w:vAlign w:val="center"/>
           </w:tcPr>
           <w:p>
@@ -1187,13 +1091,13 @@
                 <w:sz w:val="16"/>
                 <w:szCs w:val="16"/>
               </w:rPr>
-              <w:t xml:space="preserve">{{tipoDocumento}} {{documento}}</w:t>
-            </w:r>
-          </w:p>
-        </w:tc>
-        <w:tc>
-          <w:tcPr>
-            <w:tcW w:w="2600" w:type="dxa"/>
+              <w:t xml:space="preserve">{{cargo}}</w:t>
+            </w:r>
+          </w:p>
+        </w:tc>
+        <w:tc>
+          <w:tcPr>
+            <w:tcW w:w="3400" w:type="dxa"/>
             <w:vAlign w:val="center"/>
           </w:tcPr>
           <w:p>
@@ -1207,13 +1111,45 @@
                 <w:sz w:val="16"/>
                 <w:szCs w:val="16"/>
               </w:rPr>
-              <w:t xml:space="preserve">{{cargo}}</w:t>
-            </w:r>
-          </w:p>
-        </w:tc>
-        <w:tc>
-          <w:tcPr>
-            <w:tcW w:w="2400" w:type="dxa"/>
+              <w:t xml:space="preserve"> {{/firmantes}}</w:t>
+            </w:r>
+          </w:p>
+        </w:tc>
+      </w:tr>
+    </w:tbl>
+    <w:p>
+      <w:pPr>
+        <w:spacing w:before="0" w:after="120" w:line="240" w:lineRule="auto"/>
+        <w:jc w:val="left"/>
+      </w:pPr>
+      <w:r>
+        <w:rPr>
+          <w:rFonts w:ascii="Metropolis" w:eastAsia="Metropolis" w:hAnsi="Metropolis" w:cs="Metropolis"/>
+          <w:sz w:val="18"/>
+          <w:szCs w:val="18"/>
+        </w:rPr>
+        <w:t xml:space="preserve"> </w:t>
+      </w:r>
+    </w:p>
+    <w:tbl>
+      <w:tblPr>
+        <w:tblStyle w:val="Tablaconcuadrcula"/>
+        <w:tblW w:w="14400" w:type="dxa"/>
+        <w:tblLayout w:type="fixed"/>
+        <w:tblLook w:val="04A0" w:firstRow="1" w:lastRow="0" w:firstColumn="1" w:lastColumn="0" w:noHBand="0" w:noVBand="1"/>
+      </w:tblPr>
+      <w:tblGrid>
+        <w:gridCol w:w="3600"/>
+        <w:gridCol w:w="10800"/>
+      </w:tblGrid>
+      <w:tr>
+        <w:trPr>
+          <w:cantSplit/>
+        </w:trPr>
+        <w:tc>
+          <w:tcPr>
+            <w:tcW w:w="3600" w:type="dxa"/>
+            <w:shd w:val="clear" w:color="auto" w:fill="D9E2F3"/>
             <w:vAlign w:val="center"/>
           </w:tcPr>
           <w:p>
@@ -1224,10 +1160,96 @@
             <w:r>
               <w:rPr>
                 <w:rFonts w:ascii="Metropolis" w:eastAsia="Metropolis" w:hAnsi="Metropolis" w:cs="Metropolis"/>
-                <w:sz w:val="16"/>
-                <w:szCs w:val="16"/>
-              </w:rPr>
-              <w:t xml:space="preserve"> {{/firmantes}}</w:t>
+                <w:b/>
+                <w:bCs/>
+                <w:sz w:val="18"/>
+                <w:szCs w:val="18"/>
+              </w:rPr>
+              <w:t xml:space="preserve">VOTO CONSEJO UNIVERSITARIO:</w:t>
+            </w:r>
+          </w:p>
+        </w:tc>
+        <w:tc>
+          <w:tcPr>
+            <w:tcW w:w="10800" w:type="dxa"/>
+            <w:vAlign w:val="center"/>
+          </w:tcPr>
+          <w:p>
+            <w:pPr>
+              <w:spacing w:before="0" w:after="0" w:line="240" w:lineRule="auto"/>
+              <w:jc w:val="left"/>
+            </w:pPr>
+            <w:r>
+              <w:rPr>
+                <w:rFonts w:ascii="Metropolis" w:eastAsia="Metropolis" w:hAnsi="Metropolis" w:cs="Metropolis"/>
+                <w:sz w:val="18"/>
+                <w:szCs w:val="18"/>
+              </w:rPr>
+              <w:t xml:space="preserve">{{campos.acuerdoConsejo}}</w:t>
+            </w:r>
+            <w:r>
+              <w:rPr>
+                <w:rFonts w:ascii="Metropolis" w:eastAsia="Metropolis" w:hAnsi="Metropolis" w:cs="Metropolis"/>
+                <w:sz w:val="18"/>
+                <w:szCs w:val="18"/>
+              </w:rPr>
+              <w:t xml:space="preserve"> </w:t>
+            </w:r>
+            <w:r>
+              <w:rPr>
+                <w:rFonts w:ascii="Metropolis" w:eastAsia="Metropolis" w:hAnsi="Metropolis" w:cs="Metropolis"/>
+                <w:sz w:val="18"/>
+                <w:szCs w:val="18"/>
+              </w:rPr>
+              <w:t xml:space="preserve">{{campos.fechaAcuerdo}}</w:t>
+            </w:r>
+          </w:p>
+        </w:tc>
+      </w:tr>
+      <w:tr>
+        <w:trPr>
+          <w:cantSplit/>
+        </w:trPr>
+        <w:tc>
+          <w:tcPr>
+            <w:tcW w:w="3600" w:type="dxa"/>
+            <w:shd w:val="clear" w:color="auto" w:fill="D9E2F3"/>
+            <w:vAlign w:val="center"/>
+          </w:tcPr>
+          <w:p>
+            <w:pPr>
+              <w:spacing w:before="0" w:after="0" w:line="240" w:lineRule="auto"/>
+              <w:jc w:val="left"/>
+            </w:pPr>
+            <w:r>
+              <w:rPr>
+                <w:rFonts w:ascii="Metropolis" w:eastAsia="Metropolis" w:hAnsi="Metropolis" w:cs="Metropolis"/>
+                <w:b/>
+                <w:bCs/>
+                <w:sz w:val="18"/>
+                <w:szCs w:val="18"/>
+              </w:rPr>
+              <w:t xml:space="preserve">INFORMES DE VICEFINANCIERA</w:t>
+            </w:r>
+          </w:p>
+        </w:tc>
+        <w:tc>
+          <w:tcPr>
+            <w:tcW w:w="10800" w:type="dxa"/>
+            <w:vAlign w:val="center"/>
+          </w:tcPr>
+          <w:p>
+            <w:pPr>
+              <w:spacing w:before="0" w:after="0" w:line="240" w:lineRule="auto"/>
+              <w:jc w:val="left"/>
+            </w:pPr>
+            <w:r>
+              <w:rPr>
+                <w:rFonts w:ascii="Metropolis" w:eastAsia="Metropolis" w:hAnsi="Metropolis" w:cs="Metropolis"/>
+                <w:sz w:val="18"/>
+                <w:szCs w:val="18"/>
+              </w:rPr>
+              <w:t xml:space="preserve">{{campos.informesVicefinanciera}}</w:t>
             </w:r>
           </w:p>
         </w:tc>
@@ -1846,7 +1868,7 @@
               <w:sz w:val="24"/>
               <w:szCs w:val="24"/>
             </w:rPr>
-            <w:t>ACTA DE BAJA DE ACTIVOS FIJOS</w:t>
+            <w:t>BAJA DE ACTIVOS</w:t>
           </w:r>
         </w:p>
       </w:tc>

</xml_diff>